<commit_message>
- persistance save completion
</commit_message>
<xml_diff>
--- a/Documents/MMO_Project_GDD.docx
+++ b/Documents/MMO_Project_GDD.docx
@@ -39,7 +39,7 @@
         <w:pStyle w:val="BodyText"/>
       </w:pPr>
       <w:r>
-        <w:t xml:space="preserve">Version 0.5 — Living Document</w:t>
+        <w:t xml:space="preserve">Version 0.6 — Living Document</w:t>
       </w:r>
     </w:p>
     <w:p>
@@ -47,7 +47,7 @@
         <w:pStyle w:val="BodyText"/>
       </w:pPr>
       <w:r>
-        <w:t xml:space="preserve">Last updated: August 31, 2026 (save/persistence system implemented)</w:t>
+        <w:t xml:space="preserve">Last updated: August 31, 2026 (save/persistence system extended to inventory, equipment, and window layout)</w:t>
       </w:r>
     </w:p>
     <w:p>
@@ -1070,7 +1070,7 @@
         <w:pStyle w:val="FirstParagraph"/>
       </w:pPr>
       <w:r>
-        <w:t xml:space="preserve">A currency system (add/spend, with a running total) exists, and is now saved and restored across sessions (Section 8.2a), but nothing in the game currently grants or consumes Zeny — there are no shops and no enemies drop currency yet. This is intentionally deferred until a shop/economy feature is scoped.</w:t>
+        <w:t xml:space="preserve">A currency system (add/spend, with a running total) exists, and is saved and restored across sessions (Section 8.2a), but nothing in the game currently grants or consumes Zeny — there are no shops and no enemies drop currency yet. This is intentionally deferred until a shop/economy feature is scoped.</w:t>
       </w:r>
     </w:p>
     <w:bookmarkEnd w:id="49"/>
@@ -1250,7 +1250,7 @@
         <w:pStyle w:val="FirstParagraph"/>
       </w:pPr>
       <w:r>
-        <w:t xml:space="preserve">Inventory, Status, Equipment, and Skill Book open as individual panels, toggled from HUD buttons or keyboard shortcuts (I / C / E for the original three; the Skill Book currently opens from its own HUD button). Panels are draggable and remember their position for the play session; newly-opened panels cascade automatically below the HUD, wrapping to a new column when vertical space runs out, and reclaim freed space when another panel closes. Each panel has Close and Minimize controls, and clicking a panel brings it to the front of any others it overlaps. A separate, always-visible Skill Hotbar (10 slots, populated by dragging skills in from the Skill Book) sits outside this window system alongside the HUD, similar to the equipment/inventory relationship. Window position is still not saved to disk (Section 8.2a) — it resets to the default cascade on restart.</w:t>
+        <w:t xml:space="preserve">Inventory, Status, Equipment, and Skill Book open as individual panels, toggled from HUD buttons or keyboard shortcuts (I / C / E for the original three; the Skill Book currently opens from its own HUD button). Panels are draggable; each panel’s position, open/closed state, and minimized state are now saved to disk and restored on the next launch (Section 8.2a), in addition to being remembered for the current session. Newly-opened panels without a saved or dragged position cascade automatically below the HUD, wrapping to a new column when vertical space runs out, and reclaim freed space when another panel closes. Each panel has Close and Minimize controls, and clicking a panel brings it to the front of any others it overlaps. A separate, always-visible Skill Hotbar (10 slots, populated by dragging skills in from the Skill Book) sits outside this window system alongside the HUD, similar to the equipment/inventory relationship.</w:t>
       </w:r>
     </w:p>
     <w:bookmarkEnd w:id="57"/>
@@ -1399,7 +1399,7 @@
         <w:pStyle w:val="BodyText"/>
       </w:pPr>
       <w:r>
-        <w:t xml:space="preserve">The project is organized into thirteen Assembly Definitions mirroring its folder structure (including a dedicated Skills assembly and the newer Persistence assembly, described below), enforcing a one-directional dependency graph between systems and significantly reducing incremental compile times as the codebase has grown. Shared per-character data (like base stats) is consolidated behind a single holder component (</w:t>
+        <w:t xml:space="preserve">The project is organized into thirteen Assembly Definitions mirroring its folder structure (including a dedicated Skills assembly and the Persistence assembly, described below), enforcing a one-directional dependency graph between systems and significantly reducing incremental compile times as the codebase has grown. Shared per-character data (like base stats) is consolidated behind a single holder component (</w:t>
       </w:r>
       <w:r>
         <w:rPr>
@@ -1491,7 +1491,7 @@
         <w:pStyle w:val="FirstParagraph"/>
       </w:pPr>
       <w:r>
-        <w:t xml:space="preserve">A first save/load system is implemented in a new, dependency-free</w:t>
+        <w:t xml:space="preserve">A save/load system is implemented in a dependency-free</w:t>
       </w:r>
       <w:r>
         <w:t xml:space="preserve"> </w:t>
@@ -1554,19 +1554,7 @@
         <w:t xml:space="preserve"> </w:t>
       </w:r>
       <w:r>
-        <w:t xml:space="preserve">finds every implementation on the Player automatically via</w:t>
-      </w:r>
-      <w:r>
-        <w:t xml:space="preserve"> </w:t>
-      </w:r>
-      <w:r>
-        <w:rPr>
-          <w:rStyle w:val="VerbatimChar"/>
-        </w:rPr>
-        <w:t xml:space="preserve">GetComponents&lt;ISaveParticipant&gt;()</w:t>
-      </w:r>
-      <w:r>
-        <w:t xml:space="preserve">, so future systems opt in without any change to the save controller itself. State is written as a single JSON file (</w:t>
+        <w:t xml:space="preserve">finds every implementation in the loaded scene automatically (a scene-wide search that also reaches inactive objects, such as a closed window), so future systems opt in without any change to the save controller itself, regardless of whether they live under the Player or elsewhere in the hierarchy. State is written as a single JSON file (</w:t>
       </w:r>
       <w:r>
         <w:rPr>
@@ -1610,10 +1598,7 @@
         <w:pStyle w:val="BodyText"/>
       </w:pPr>
       <w:r>
-        <w:t xml:space="preserve">Today’s save covers Base and Job level and experience, the six base stats and unspent stat/skill points, class, Zeny, every learned skill and its level, all ten hotbar slot assignments, and the Mage’s selected element. Learned skills and hotbar slots are resolved through a new</w:t>
-      </w:r>
-      <w:r>
-        <w:t xml:space="preserve"> </w:t>
+        <w:t xml:space="preserve">The save now covers Base and Job level and experience, the six base stats and unspent stat/skill points, the player’s class, Zeny, every learned skill and its level, all ten hotbar slot assignments, the Mage’s selected element, the full contents of the inventory (including slots only allocated because earlier pages filled up), every currently equipped item plus the ammo count, and every UI window’s open, minimized, and position state. Learned skills, hotbar slots, inventory contents, and equipped items are each resolved through a small database asset (</w:t>
       </w:r>
       <w:r>
         <w:rPr>
@@ -1625,7 +1610,7 @@
         <w:t xml:space="preserve"> </w:t>
       </w:r>
       <w:r>
-        <w:t xml:space="preserve">asset, which maps each</w:t>
+        <w:t xml:space="preserve">or the newer</w:t>
       </w:r>
       <w:r>
         <w:t xml:space="preserve"> </w:t>
@@ -1634,13 +1619,10 @@
         <w:rPr>
           <w:rStyle w:val="VerbatimChar"/>
         </w:rPr>
-        <w:t xml:space="preserve">SkillDefinition</w:t>
-      </w:r>
-      <w:r>
-        <w:t xml:space="preserve"> </w:t>
-      </w:r>
-      <w:r>
-        <w:t xml:space="preserve">to a stable string id — needed because the underlying</w:t>
+        <w:t xml:space="preserve">ItemDatabase</w:t>
+      </w:r>
+      <w:r>
+        <w:t xml:space="preserve">) mapping the relevant ScriptableObject type to a stable string id — needed because</w:t>
       </w:r>
       <w:r>
         <w:t xml:space="preserve"> </w:t>
@@ -1655,7 +1637,7 @@
         <w:t xml:space="preserve"> </w:t>
       </w:r>
       <w:r>
-        <w:t xml:space="preserve">serializer can’t store a direct ScriptableObject reference. Inventory contents, equipped items (including the Ammo stack), and window layout/position are explicitly not covered yet — v2 scope, tracked in the companion tracker’s Roadmap sheet.</w:t>
+        <w:t xml:space="preserve">can’t store a direct ScriptableObject reference or a multi-slot equipped item as anything richer than an id plus a slot bitmask. With this pass, no player-progression or player-owned-state system in the game is still lost when Play Mode stops.</w:t>
       </w:r>
     </w:p>
     <w:bookmarkEnd w:id="62"/>
@@ -1691,7 +1673,7 @@
         <w:pStyle w:val="FirstParagraph"/>
       </w:pPr>
       <w:r>
-        <w:t xml:space="preserve">The architecture is built anticipating a future authoritative-server model — a networking framework such as Fish-Networking is under consideration, with each map becoming an independent server process and a Nakama-backed persistence layer for accounts and player data. None of this is implemented yet: the game runs fully client-side and client-trusted today, which is expected and appropriate for the current single-player prototyping phase. The new local save system’s</w:t>
+        <w:t xml:space="preserve">The architecture is built anticipating a future authoritative-server model — a networking framework such as Fish-Networking is under consideration, with each map becoming an independent server process and a Nakama-backed persistence layer for accounts and player data. None of this is implemented yet: the game runs fully client-side and client-trusted today, which is expected and appropriate for the current single-player prototyping phase. The local save system’s</w:t>
       </w:r>
       <w:r>
         <w:t xml:space="preserve"> </w:t>
@@ -1749,7 +1731,7 @@
         <w:pStyle w:val="FirstParagraph"/>
       </w:pPr>
       <w:r>
-        <w:t xml:space="preserve">The companion Excel tracker holds the full, continuously-updated implementation checklist. In summary, the following systems are implemented and playable today: player movement and camera, the base/sub-stat system, enemy AI with Aggressive/Passive behavior modes, the PvE targeting and auto-attack combat loop with per-weapon attack range, health and mana, dual Base/Job leveling, the six-class system with class-differentiated basic attacks (Archer ammo, Thief dual-wield, Swordman block, Mage mana cost/element selection), weight-based inventory, multi-slot equipment with level/class validation, the Ammo item type and slot, loot drops with item tooltips, the draggable window-based UI and HUD (including an ammo counter), a skill system with seven finished Damage/Heal skills covering all six base classes (missing only their icons) using a Skill Book and 10-slot drag-assignable hotbar, a first save/persistence system covering progression/class/skills/hotbar (Section 8.2a), first mob content (Poring/Poporing) as Prefab Variants, and the thirteen-assembly code architecture.</w:t>
+        <w:t xml:space="preserve">The companion Excel tracker holds the full, continuously-updated implementation checklist. In summary, the following systems are implemented and playable today: player movement and camera, the base/sub-stat system, enemy AI with Aggressive/Passive behavior modes, the PvE targeting and auto-attack combat loop with per-weapon attack range, health and mana, dual Base/Job leveling, the six-class system with class-differentiated basic attacks (Archer ammo, Thief dual-wield, Swordman block, Mage mana cost/element selection), weight-based inventory, multi-slot equipment with level/class validation, the Ammo item type and slot, loot drops with item tooltips, the draggable window-based UI and HUD (including an ammo counter), a skill system with seven finished Damage/Heal skills covering all six base classes (missing only their icons) using a Skill Book and 10-slot drag-assignable hotbar, a save/persistence system now covering progression, class, skills, hotbar, inventory, equipment, and window layout (Section 8.2a), first mob content (Poring/Poporing) as Prefab Variants, and the thirteen-assembly code architecture.</w:t>
       </w:r>
     </w:p>
     <w:bookmarkEnd w:id="66"/>
@@ -1770,7 +1752,7 @@
         </w:numPr>
       </w:pPr>
       <w:r>
-        <w:t xml:space="preserve">Extending the save system to Inventory, Equipment/Ammo, and window layout (v2 scope) — the largest remaining persistence gap now that progression, class, skills, and hotbar are covered.</w:t>
+        <w:t xml:space="preserve">Additional mob variety beyond the current Poring/Poporing pair.</w:t>
       </w:r>
     </w:p>
     <w:p>
@@ -1781,29 +1763,18 @@
         </w:numPr>
       </w:pPr>
       <w:r>
+        <w:t xml:space="preserve">Making the Mage’s selectable element actually affect damage, since the selection already exists but the resistance/multiplier system behind it does not — a relatively contained way to close a loop that’s already half-open.</w:t>
+      </w:r>
+    </w:p>
+    <w:p>
+      <w:pPr>
+        <w:numPr>
+          <w:ilvl w:val="0"/>
+          <w:numId w:val="1008"/>
+        </w:numPr>
+      </w:pPr>
+      <w:r>
         <w:t xml:space="preserve">Authoring icons for FireBolt, Mammonite, and Envenom in Unity’s Sprite Editor — the only remaining gap in the skill roster, and purely an art/editor task at this point.</w:t>
-      </w:r>
-    </w:p>
-    <w:p>
-      <w:pPr>
-        <w:numPr>
-          <w:ilvl w:val="0"/>
-          <w:numId w:val="1008"/>
-        </w:numPr>
-      </w:pPr>
-      <w:r>
-        <w:t xml:space="preserve">Additional mob variety beyond the current Poring/Poporing pair.</w:t>
-      </w:r>
-    </w:p>
-    <w:p>
-      <w:pPr>
-        <w:numPr>
-          <w:ilvl w:val="0"/>
-          <w:numId w:val="1008"/>
-        </w:numPr>
-      </w:pPr>
-      <w:r>
-        <w:t xml:space="preserve">Making the Mage’s selectable element actually affect damage, since the selection already exists but the resistance/multiplier system behind it does not — a relatively contained way to close a loop that’s already half-open.</w:t>
       </w:r>
     </w:p>
     <w:bookmarkEnd w:id="67"/>

</xml_diff>

<commit_message>
Split skill database by class, fix orphaned save-data GUID
Skill Book now resolves each class's skills through a new
ClassSkillDatabaseLookup instead of one shared list, and updates
automatically when the class changes. Also fixes a stale GUID on
SkillDatabase.asset.meta that was breaking skill/hotbar save-load.
</commit_message>
<xml_diff>
--- a/Documents/MMO_Project_GDD.docx
+++ b/Documents/MMO_Project_GDD.docx
@@ -39,7 +39,7 @@
         <w:pStyle w:val="BodyText"/>
       </w:pPr>
       <w:r>
-        <w:t xml:space="preserve">Version 0.6 — Living Document</w:t>
+        <w:t>Version 0.8 — Living Document</w:t>
       </w:r>
     </w:p>
     <w:p>
@@ -47,7 +47,7 @@
         <w:pStyle w:val="BodyText"/>
       </w:pPr>
       <w:r>
-        <w:t xml:space="preserve">Last updated: August 31, 2026 (save/persistence system extended to inventory, equipment, and window layout)</w:t>
+        <w:t>Last updated: September 9, 2026 (Swordman detailed against the real Ragnarok Online reference; Magnum Break added as the project’s first area-of-effect skill; passive skills and weapon subtypes implemented, with Sword Mastery and Two-Handed Sword Mastery as the first passive skills)</w:t>
       </w:r>
     </w:p>
     <w:p>
@@ -552,6 +552,14 @@
       </w:r>
       <w:r>
         <w:t xml:space="preserve">entry point — this is intentional groundwork for class evolution (e.g. a Swordman promoting to Knight or Crusader), a system that is planned but not yet designed or implemented.</w:t>
+      </w:r>
+    </w:p>
+    <w:p>
+      <w:pPr>
+        <w:pStyle w:val="BodyText"/>
+      </w:pPr>
+      <w:r>
+        <w:t>Starting with Swordman, each class is getting a dedicated reference document, sourced against the real Ragnarok Online wiki data for that class: its full skill list, stat bonuses, and recommended builds, alongside a clear implemented/not-yet-implemented breakdown per skill — see the companion CLASSES_SWORDMAN.md (Section 10.1) for the first one.</w:t>
       </w:r>
     </w:p>
     <w:p>
@@ -882,7 +890,7 @@
         <w:pStyle w:val="BodyText"/>
       </w:pPr>
       <w:r>
-        <w:t xml:space="preserve">Seven skills now exist as finished content, one or more per base class: a small self-only heal available to any class (BasicHeal), a stronger heal restricted to Acolyte (StrongHeal, intended for ally targeting once that exists), a short-range physical damage skill restricted to Swordman (Bash), a long-range physical damage skill restricted to Archer (Snipe), a medium-range magic damage skill restricted to Mage (FireBolt), a short-range physical damage skill restricted to Merchant (Mammonite), and a short-range physical damage skill restricted to Thief (Envenom). All seven are wired into the Skill Book. The one remaining gap is cosmetic: FireBolt, Mammonite, and Envenom have no icon yet, since the shared skill-icon sprite sheet only has four slices (already used by the original four skills) — a fifth, sixth, and seventh slice need to be authored in Unity’s Sprite Editor before these three show anything but a blank icon in the Skill Book and hotbar. Between skills and the class-specific basic-attack behavior in Section 4.1, every base class now has at least one piece of distinct, playable combat identity.</w:t>
+        <w:t>Ten skills now exist as finished content, one or more per base class: a small self-only heal available to any class (BasicHeal), a stronger heal restricted to Acolyte (StrongHeal, intended for ally targeting once that exists), four skills restricted to Swordman — a short-range single-target hit (Bash, now also granting a small bonus to its own hit chance that scales with level), the project’s first area-of-effect skill (Magnum Break, hitting every enemy within a radius of the caster instead of a single selected target, needing no target to be pre-selected at all), and the project’s first two passive skills (Sword Mastery and Two-Handed Sword Mastery, each granting a flat Status ATK bonus automatically while learned and a matching weapon subtype equipped, with no cast or hotbar slot involved at all) — a long-range physical damage skill restricted to Archer (Snipe), a medium-range magic damage skill restricted to Mage (FireBolt), a short-range physical damage skill restricted to Merchant (Mammonite), and a short-range physical damage skill restricted to Thief (Envenom). All ten are wired into the Skill Book. The remaining gap is still cosmetic: FireBolt, Mammonite, Envenom, Magnum Break, Sword Mastery, and Two-Handed Sword Mastery have no icon yet, since the shared skill-icon sprite sheet only has four slices (already used by the original four skills) — six more slices need to be authored in Unity’s Sprite Editor before these six show anything but a blank icon in the Skill Book and hotbar. Between skills and the class-specific basic-attack behavior in Section 4.1, every base class now has at least one piece of distinct, playable combat identity.</w:t>
       </w:r>
     </w:p>
     <w:p>
@@ -943,7 +951,7 @@
         </w:numPr>
       </w:pPr>
       <w:r>
-        <w:t xml:space="preserve">Equipment — items that occupy one or more equipment slots and grant stat bonuses. Hand-slot equipment also carries a Weapon Type (Melee or Ranged) and its own basic-attack range.</w:t>
+        <w:t>Equipment — items that occupy one or more equipment slots and grant stat bonuses. Hand-slot equipment also carries a Weapon Type (Melee or Ranged), a finer-grained Weapon Subtype (Dagger, One-Hand Sword, Two-Hand Sword, One-Hand Axe, Two-Hand Axe, Mace, Spear, Bow, or Book — used by weapon-mastery passive skills, see Section 4.5) and its own basic-attack range.</w:t>
       </w:r>
     </w:p>
     <w:p>
@@ -1731,7 +1739,7 @@
         <w:pStyle w:val="FirstParagraph"/>
       </w:pPr>
       <w:r>
-        <w:t xml:space="preserve">The companion Excel tracker holds the full, continuously-updated implementation checklist. In summary, the following systems are implemented and playable today: player movement and camera, the base/sub-stat system, enemy AI with Aggressive/Passive behavior modes, the PvE targeting and auto-attack combat loop with per-weapon attack range, health and mana, dual Base/Job leveling, the six-class system with class-differentiated basic attacks (Archer ammo, Thief dual-wield, Swordman block, Mage mana cost/element selection), weight-based inventory, multi-slot equipment with level/class validation, the Ammo item type and slot, loot drops with item tooltips, the draggable window-based UI and HUD (including an ammo counter), a skill system with seven finished Damage/Heal skills covering all six base classes (missing only their icons) using a Skill Book and 10-slot drag-assignable hotbar, a save/persistence system now covering progression, class, skills, hotbar, inventory, equipment, and window layout (Section 8.2a), first mob content (Poring/Poporing) as Prefab Variants, and the thirteen-assembly code architecture.</w:t>
+        <w:t>The companion Excel tracker holds the full, continuously-updated implementation checklist. In summary, the following systems are implemented and playable today: player movement and camera, the base/sub-stat system, enemy AI with Aggressive/Passive behavior modes, the PvE targeting and auto-attack combat loop with per-weapon attack range, health and mana, dual Base/Job leveling, the six-class system with class-differentiated basic attacks (Archer ammo, Thief dual-wield, Swordman block, Mage mana cost/element selection), weight-based inventory, multi-slot equipment with level/class validation and a Weapon Subtype per hand-slot item, the Ammo item type and slot, loot drops with item tooltips, the draggable window-based UI and HUD (including an ammo counter), a skill system with ten finished skills (Damage, Heal, or the new Passive effect type) covering all six base classes (six of the ten still missing their icons) using a Skill Book and 10-slot drag-assignable hotbar, a save/persistence system now covering progression, class, skills, hotbar, inventory, equipment, and window layout (Section 8.2a), first mob content (Poring/Poporing) as Prefab Variants, and the thirteen-assembly code architecture.</w:t>
       </w:r>
     </w:p>
     <w:bookmarkEnd w:id="66"/>
@@ -1774,7 +1782,7 @@
         </w:numPr>
       </w:pPr>
       <w:r>
-        <w:t xml:space="preserve">Authoring icons for FireBolt, Mammonite, and Envenom in Unity’s Sprite Editor — the only remaining gap in the skill roster, and purely an art/editor task at this point.</w:t>
+        <w:t>Authoring icons for FireBolt, Mammonite, Envenom, Magnum Break, Sword Mastery, and Two-Handed Sword Mastery in Unity’s Sprite Editor — the only remaining gap in the skill roster, and purely an art/editor task at this point.</w:t>
       </w:r>
     </w:p>
     <w:bookmarkEnd w:id="67"/>
@@ -1911,6 +1919,12 @@
       </w:pPr>
       <w:r>
         <w:t xml:space="preserve">10.1 Companion Documents</w:t>
+      </w:r>
+    </w:p>
+    <w:p>
+      <w:pPr/>
+      <w:r>
+        <w:t>CLASSES_SWORDMAN.md — detailed, Ragnarok Online-sourced reference for the Swordman class: full skill list, stat bonuses, recommended builds, and an implemented/not-yet-implemented breakdown per skill. The first of a planned per-class series.</w:t>
       </w:r>
     </w:p>
     <w:p>

</xml_diff>